<commit_message>
Add cross-page navigation (editions + archive) for site browsing
</commit_message>
<xml_diff>
--- a/Benign-GynSurg-Journal-Club-2026-06-27.docx
+++ b/Benign-GynSurg-Journal-Club-2026-06-27.docx
@@ -131,7 +131,7 @@
         </w:rPr>
         <w:t xml:space="preserve">Journal access &amp; resources:  </w:t>
       </w:r>
-      <w:hyperlink w:history="1" r:id="rIdhhnndf1v3uguzsnt1vy6t">
+      <w:hyperlink w:history="1" r:id="rIdabn8jfdh9mqalmizxmmmo">
         <w:r>
           <w:rPr>
             <w:rStyle w:val="Hyperlink"/>
@@ -149,7 +149,7 @@
         </w:rPr>
         <w:t xml:space="preserve">   ·   </w:t>
       </w:r>
-      <w:hyperlink w:history="1" r:id="rIdsfj4glkebjntpj8a_fqkr">
+      <w:hyperlink w:history="1" r:id="rIdilelqzelabwu83gppzlnd">
         <w:r>
           <w:rPr>
             <w:rStyle w:val="Hyperlink"/>
@@ -167,7 +167,7 @@
         </w:rPr>
         <w:t xml:space="preserve">   ·   </w:t>
       </w:r>
-      <w:hyperlink w:history="1" r:id="rId3w2rgybrfp3vq1zkytm5-">
+      <w:hyperlink w:history="1" r:id="rIdupi4xkji6y8ihtuouamnn">
         <w:r>
           <w:rPr>
             <w:rStyle w:val="Hyperlink"/>
@@ -185,7 +185,7 @@
         </w:rPr>
         <w:t xml:space="preserve">   ·   </w:t>
       </w:r>
-      <w:hyperlink w:history="1" r:id="rId8nnqaneveqcnzi_xq1or4">
+      <w:hyperlink w:history="1" r:id="rIdi3lgqavx1neknrxw443g8">
         <w:r>
           <w:rPr>
             <w:rStyle w:val="Hyperlink"/>
@@ -203,7 +203,7 @@
         </w:rPr>
         <w:t xml:space="preserve">   ·   </w:t>
       </w:r>
-      <w:hyperlink w:history="1" r:id="rIdt3glt0yulfztsgtucwmm8">
+      <w:hyperlink w:history="1" r:id="rIdr21vjk2tmw_4czbsthvan">
         <w:r>
           <w:rPr>
             <w:rStyle w:val="Hyperlink"/>
@@ -221,7 +221,7 @@
         </w:rPr>
         <w:t xml:space="preserve">   ·   </w:t>
       </w:r>
-      <w:hyperlink w:history="1" r:id="rId7rtuinz1yvfbrrxv55nvr">
+      <w:hyperlink w:history="1" r:id="rIdnnychc2jzgqymff8vonon">
         <w:r>
           <w:rPr>
             <w:rStyle w:val="Hyperlink"/>
@@ -239,7 +239,7 @@
         </w:rPr>
         <w:t xml:space="preserve">   ·   </w:t>
       </w:r>
-      <w:hyperlink w:history="1" r:id="rIdvoosobkc6srl7nqu-puit">
+      <w:hyperlink w:history="1" r:id="rIdpnmtjoc-rep722iwrhj53">
         <w:r>
           <w:rPr>
             <w:rStyle w:val="Hyperlink"/>
@@ -257,7 +257,7 @@
         </w:rPr>
         <w:t xml:space="preserve">   ·   </w:t>
       </w:r>
-      <w:hyperlink w:history="1" r:id="rIdrlqsjl9raj9jwgpmuqmo_">
+      <w:hyperlink w:history="1" r:id="rIdklmjjsiy8axnh0aperwrj">
         <w:r>
           <w:rPr>
             <w:rStyle w:val="Hyperlink"/>
@@ -275,7 +275,7 @@
         </w:rPr>
         <w:t xml:space="preserve">   ·   </w:t>
       </w:r>
-      <w:hyperlink w:history="1" r:id="rIdb_aian1jw6jcxu5pklpxy">
+      <w:hyperlink w:history="1" r:id="rId4r0m8ftdau9z5ncdyis5v">
         <w:r>
           <w:rPr>
             <w:rStyle w:val="Hyperlink"/>
@@ -293,7 +293,7 @@
         </w:rPr>
         <w:t xml:space="preserve">   ·   </w:t>
       </w:r>
-      <w:hyperlink w:history="1" r:id="rIdzpft5o-kck1vdlkzbeced">
+      <w:hyperlink w:history="1" r:id="rIdklny5zw1zrpetaxdjof4u">
         <w:r>
           <w:rPr>
             <w:rStyle w:val="Hyperlink"/>
@@ -461,7 +461,7 @@
         </w:rPr>
         <w:t xml:space="preserve">Source: </w:t>
       </w:r>
-      <w:hyperlink w:history="1" r:id="rIdu98jacesvvwr6d2jl4ozv">
+      <w:hyperlink w:history="1" r:id="rIdaokogbkiqkesn_nh1ig2e">
         <w:r>
           <w:rPr>
             <w:rStyle w:val="Hyperlink"/>
@@ -734,7 +734,7 @@
         </w:rPr>
         <w:t xml:space="preserve">Source: </w:t>
       </w:r>
-      <w:hyperlink w:history="1" r:id="rIdabhe84wbd_sbpglcmv4aw">
+      <w:hyperlink w:history="1" r:id="rIdct-88jtqbr8ppmuejhaye">
         <w:r>
           <w:rPr>
             <w:rStyle w:val="Hyperlink"/>
@@ -1040,7 +1040,7 @@
         </w:rPr>
         <w:t xml:space="preserve">Source: </w:t>
       </w:r>
-      <w:hyperlink w:history="1" r:id="rIdisf3rdmzbarcvxwgg_elw">
+      <w:hyperlink w:history="1" r:id="rIdisfpm-bdkl0uovvc9otii">
         <w:r>
           <w:rPr>
             <w:rStyle w:val="Hyperlink"/>
@@ -1346,7 +1346,7 @@
         </w:rPr>
         <w:t xml:space="preserve">Source: </w:t>
       </w:r>
-      <w:hyperlink w:history="1" r:id="rId7amasue1ls_abttopygaf">
+      <w:hyperlink w:history="1" r:id="rIdtwyo6ciub_gvwxogke11a">
         <w:r>
           <w:rPr>
             <w:rStyle w:val="Hyperlink"/>
@@ -1652,7 +1652,7 @@
         </w:rPr>
         <w:t xml:space="preserve">Source: </w:t>
       </w:r>
-      <w:hyperlink w:history="1" r:id="rIdi4socbgjdf2f_3qcsa2mu">
+      <w:hyperlink w:history="1" r:id="rId1u-saincp6n8moq03g--a">
         <w:r>
           <w:rPr>
             <w:rStyle w:val="Hyperlink"/>
@@ -1958,7 +1958,7 @@
         </w:rPr>
         <w:t xml:space="preserve">Source: </w:t>
       </w:r>
-      <w:hyperlink w:history="1" r:id="rIdmuc57cjojkhhsqt9bdufr">
+      <w:hyperlink w:history="1" r:id="rIdvcliz8i-r1xj-n6ipc0j8">
         <w:r>
           <w:rPr>
             <w:rStyle w:val="Hyperlink"/>
@@ -2264,7 +2264,7 @@
         </w:rPr>
         <w:t xml:space="preserve">Source: </w:t>
       </w:r>
-      <w:hyperlink w:history="1" r:id="rIdpnndz7xxm6nnugyjztraq">
+      <w:hyperlink w:history="1" r:id="rId4bmv3mjypcrg2pujjyhqq">
         <w:r>
           <w:rPr>
             <w:rStyle w:val="Hyperlink"/>
@@ -2454,7 +2454,7 @@
         <w:spacing w:after="70"/>
         <w:ind w:left="460"/>
       </w:pPr>
-      <w:hyperlink w:history="1" r:id="rIdsq-70nxg7r_3eeiiojp49">
+      <w:hyperlink w:history="1" r:id="rIddr32qjddclapftx3kasfd">
         <w:r>
           <w:rPr>
             <w:rStyle w:val="Hyperlink"/>
@@ -2498,7 +2498,7 @@
         <w:spacing w:after="70"/>
         <w:ind w:left="460"/>
       </w:pPr>
-      <w:hyperlink w:history="1" r:id="rIdf9am12_tjyzo9rt_gecpf">
+      <w:hyperlink w:history="1" r:id="rIddxmwgbajah2ffj_aelmzl">
         <w:r>
           <w:rPr>
             <w:rStyle w:val="Hyperlink"/>
@@ -2542,7 +2542,7 @@
         <w:spacing w:after="70"/>
         <w:ind w:left="460"/>
       </w:pPr>
-      <w:hyperlink w:history="1" r:id="rIdkmsvsbgkq62dnte6bfcd1">
+      <w:hyperlink w:history="1" r:id="rIdeugcoxsnv4vkiket7q8ar">
         <w:r>
           <w:rPr>
             <w:rStyle w:val="Hyperlink"/>
@@ -2586,7 +2586,7 @@
         <w:spacing w:after="70"/>
         <w:ind w:left="460"/>
       </w:pPr>
-      <w:hyperlink w:history="1" r:id="rIdw2wxzctcookb3afr-6_zv">
+      <w:hyperlink w:history="1" r:id="rId1shaa76remaoty3wn-pot">
         <w:r>
           <w:rPr>
             <w:rStyle w:val="Hyperlink"/>
@@ -2630,7 +2630,7 @@
         <w:spacing w:after="70"/>
         <w:ind w:left="460"/>
       </w:pPr>
-      <w:hyperlink w:history="1" r:id="rIdky_21qpw_bq6ehe-exmxj">
+      <w:hyperlink w:history="1" r:id="rIdhbmfwqjuzgfwv90i5e5tm">
         <w:r>
           <w:rPr>
             <w:rStyle w:val="Hyperlink"/>

</xml_diff>

<commit_message>
Restructure site: homepage hub listing clubs + issues
Replace the per-edition root pages and edition-toggle nav with a single
homepage (index.html) that lists each journal club and its issues (read
online / PDF / Word). Each issue now lives at issues/<id>/<date>.html with a
back-link to the hub.
</commit_message>
<xml_diff>
--- a/Benign-GynSurg-Journal-Club-2026-06-27.docx
+++ b/Benign-GynSurg-Journal-Club-2026-06-27.docx
@@ -131,7 +131,7 @@
         </w:rPr>
         <w:t xml:space="preserve">Journal access &amp; resources:  </w:t>
       </w:r>
-      <w:hyperlink w:history="1" r:id="rIdabn8jfdh9mqalmizxmmmo">
+      <w:hyperlink w:history="1" r:id="rIdmxsy08zjwdq_hz0hnir16">
         <w:r>
           <w:rPr>
             <w:rStyle w:val="Hyperlink"/>
@@ -149,7 +149,7 @@
         </w:rPr>
         <w:t xml:space="preserve">   ·   </w:t>
       </w:r>
-      <w:hyperlink w:history="1" r:id="rIdilelqzelabwu83gppzlnd">
+      <w:hyperlink w:history="1" r:id="rId6i-1uua6xmmrnplwviif6">
         <w:r>
           <w:rPr>
             <w:rStyle w:val="Hyperlink"/>
@@ -167,7 +167,7 @@
         </w:rPr>
         <w:t xml:space="preserve">   ·   </w:t>
       </w:r>
-      <w:hyperlink w:history="1" r:id="rIdupi4xkji6y8ihtuouamnn">
+      <w:hyperlink w:history="1" r:id="rIdekgabszeppucuoufbmxwi">
         <w:r>
           <w:rPr>
             <w:rStyle w:val="Hyperlink"/>
@@ -185,7 +185,7 @@
         </w:rPr>
         <w:t xml:space="preserve">   ·   </w:t>
       </w:r>
-      <w:hyperlink w:history="1" r:id="rIdi3lgqavx1neknrxw443g8">
+      <w:hyperlink w:history="1" r:id="rIdbp2zvrvqvpf_hynmo_prn">
         <w:r>
           <w:rPr>
             <w:rStyle w:val="Hyperlink"/>
@@ -203,7 +203,7 @@
         </w:rPr>
         <w:t xml:space="preserve">   ·   </w:t>
       </w:r>
-      <w:hyperlink w:history="1" r:id="rIdr21vjk2tmw_4czbsthvan">
+      <w:hyperlink w:history="1" r:id="rIdmpwvx-yhrcqj7jvobpg6j">
         <w:r>
           <w:rPr>
             <w:rStyle w:val="Hyperlink"/>
@@ -221,7 +221,7 @@
         </w:rPr>
         <w:t xml:space="preserve">   ·   </w:t>
       </w:r>
-      <w:hyperlink w:history="1" r:id="rIdnnychc2jzgqymff8vonon">
+      <w:hyperlink w:history="1" r:id="rIdfrktlww8qtmvoybxspxa9">
         <w:r>
           <w:rPr>
             <w:rStyle w:val="Hyperlink"/>
@@ -239,7 +239,7 @@
         </w:rPr>
         <w:t xml:space="preserve">   ·   </w:t>
       </w:r>
-      <w:hyperlink w:history="1" r:id="rIdpnmtjoc-rep722iwrhj53">
+      <w:hyperlink w:history="1" r:id="rIdp-mqdsnait6ex0ccc33ng">
         <w:r>
           <w:rPr>
             <w:rStyle w:val="Hyperlink"/>
@@ -257,7 +257,7 @@
         </w:rPr>
         <w:t xml:space="preserve">   ·   </w:t>
       </w:r>
-      <w:hyperlink w:history="1" r:id="rIdklmjjsiy8axnh0aperwrj">
+      <w:hyperlink w:history="1" r:id="rIdtyj1nv5saoajhifuy6gik">
         <w:r>
           <w:rPr>
             <w:rStyle w:val="Hyperlink"/>
@@ -275,7 +275,7 @@
         </w:rPr>
         <w:t xml:space="preserve">   ·   </w:t>
       </w:r>
-      <w:hyperlink w:history="1" r:id="rId4r0m8ftdau9z5ncdyis5v">
+      <w:hyperlink w:history="1" r:id="rIddyw0dsve7b4rg3o3r7n0u">
         <w:r>
           <w:rPr>
             <w:rStyle w:val="Hyperlink"/>
@@ -293,7 +293,7 @@
         </w:rPr>
         <w:t xml:space="preserve">   ·   </w:t>
       </w:r>
-      <w:hyperlink w:history="1" r:id="rIdklny5zw1zrpetaxdjof4u">
+      <w:hyperlink w:history="1" r:id="rIdmkz8ya68zd5cjj1-b8qft">
         <w:r>
           <w:rPr>
             <w:rStyle w:val="Hyperlink"/>
@@ -461,7 +461,7 @@
         </w:rPr>
         <w:t xml:space="preserve">Source: </w:t>
       </w:r>
-      <w:hyperlink w:history="1" r:id="rIdaokogbkiqkesn_nh1ig2e">
+      <w:hyperlink w:history="1" r:id="rIdjevwhbozkfzdyksmgpnie">
         <w:r>
           <w:rPr>
             <w:rStyle w:val="Hyperlink"/>
@@ -734,7 +734,7 @@
         </w:rPr>
         <w:t xml:space="preserve">Source: </w:t>
       </w:r>
-      <w:hyperlink w:history="1" r:id="rIdct-88jtqbr8ppmuejhaye">
+      <w:hyperlink w:history="1" r:id="rIdvtcdwqbqm6xrsyzmb1zwd">
         <w:r>
           <w:rPr>
             <w:rStyle w:val="Hyperlink"/>
@@ -1040,7 +1040,7 @@
         </w:rPr>
         <w:t xml:space="preserve">Source: </w:t>
       </w:r>
-      <w:hyperlink w:history="1" r:id="rIdisfpm-bdkl0uovvc9otii">
+      <w:hyperlink w:history="1" r:id="rIdgukzcyxfdx2ovwi-g4pmh">
         <w:r>
           <w:rPr>
             <w:rStyle w:val="Hyperlink"/>
@@ -1346,7 +1346,7 @@
         </w:rPr>
         <w:t xml:space="preserve">Source: </w:t>
       </w:r>
-      <w:hyperlink w:history="1" r:id="rIdtwyo6ciub_gvwxogke11a">
+      <w:hyperlink w:history="1" r:id="rIde13xbzwu6sqhtwlj4qocm">
         <w:r>
           <w:rPr>
             <w:rStyle w:val="Hyperlink"/>
@@ -1652,7 +1652,7 @@
         </w:rPr>
         <w:t xml:space="preserve">Source: </w:t>
       </w:r>
-      <w:hyperlink w:history="1" r:id="rId1u-saincp6n8moq03g--a">
+      <w:hyperlink w:history="1" r:id="rId-1wfrho9ksrhpvdjhlduq">
         <w:r>
           <w:rPr>
             <w:rStyle w:val="Hyperlink"/>
@@ -1958,7 +1958,7 @@
         </w:rPr>
         <w:t xml:space="preserve">Source: </w:t>
       </w:r>
-      <w:hyperlink w:history="1" r:id="rIdvcliz8i-r1xj-n6ipc0j8">
+      <w:hyperlink w:history="1" r:id="rId6tbzd_nxnfwdr6ykd6kay">
         <w:r>
           <w:rPr>
             <w:rStyle w:val="Hyperlink"/>
@@ -2264,7 +2264,7 @@
         </w:rPr>
         <w:t xml:space="preserve">Source: </w:t>
       </w:r>
-      <w:hyperlink w:history="1" r:id="rId4bmv3mjypcrg2pujjyhqq">
+      <w:hyperlink w:history="1" r:id="rId2gizysis3gzhl9rb2k9re">
         <w:r>
           <w:rPr>
             <w:rStyle w:val="Hyperlink"/>
@@ -2454,7 +2454,7 @@
         <w:spacing w:after="70"/>
         <w:ind w:left="460"/>
       </w:pPr>
-      <w:hyperlink w:history="1" r:id="rIddr32qjddclapftx3kasfd">
+      <w:hyperlink w:history="1" r:id="rId3wcvuflnducmkxvsthvxu">
         <w:r>
           <w:rPr>
             <w:rStyle w:val="Hyperlink"/>
@@ -2498,7 +2498,7 @@
         <w:spacing w:after="70"/>
         <w:ind w:left="460"/>
       </w:pPr>
-      <w:hyperlink w:history="1" r:id="rIddxmwgbajah2ffj_aelmzl">
+      <w:hyperlink w:history="1" r:id="rIdgrt0pshsczrfvztf2gioy">
         <w:r>
           <w:rPr>
             <w:rStyle w:val="Hyperlink"/>
@@ -2542,7 +2542,7 @@
         <w:spacing w:after="70"/>
         <w:ind w:left="460"/>
       </w:pPr>
-      <w:hyperlink w:history="1" r:id="rIdeugcoxsnv4vkiket7q8ar">
+      <w:hyperlink w:history="1" r:id="rIdrvnp3mvsgn1kfseeuvtik">
         <w:r>
           <w:rPr>
             <w:rStyle w:val="Hyperlink"/>
@@ -2586,7 +2586,7 @@
         <w:spacing w:after="70"/>
         <w:ind w:left="460"/>
       </w:pPr>
-      <w:hyperlink w:history="1" r:id="rId1shaa76remaoty3wn-pot">
+      <w:hyperlink w:history="1" r:id="rIdtdlgzpfxesxiidqocvw1z">
         <w:r>
           <w:rPr>
             <w:rStyle w:val="Hyperlink"/>
@@ -2630,7 +2630,7 @@
         <w:spacing w:after="70"/>
         <w:ind w:left="460"/>
       </w:pPr>
-      <w:hyperlink w:history="1" r:id="rIdhbmfwqjuzgfwv90i5e5tm">
+      <w:hyperlink w:history="1" r:id="rId2wha7agofmeu-l_4pigoq">
         <w:r>
           <w:rPr>
             <w:rStyle w:val="Hyperlink"/>

</xml_diff>